<commit_message>
feat: implement no-code module for promotions and add DOCX export helper functions for banquet menus
</commit_message>
<xml_diff>
--- a/backend-app/samples/bao_gia.docx
+++ b/backend-app/samples/bao_gia.docx
@@ -1,47 +1,5 @@
 
-<file path=docProps\app.xml><?xml version="1.0" encoding="utf-8"?>
-<Properties xmlns="http://schemas.openxmlformats.org/officeDocument/2006/extended-properties" xmlns:vt="http://schemas.openxmlformats.org/officeDocument/2006/docPropsVTypes">
-  <Template>Normal</Template>
-  <TotalTime>0</TotalTime>
-  <Application>Microsoft Office Word</Application>
-  <DocSecurity>0</DocSecurity>
-  <ScaleCrop>false</ScaleCrop>
-  <LinksUpToDate>false</LinksUpToDate>
-  <SharedDoc>false</SharedDoc>
-  <HyperlinksChanged>false</HyperlinksChanged>
-  <AppVersion>12.0000</AppVersion>
-</Properties>
-</file>
-
-<file path=docProps\core.xml><?xml version="1.0" encoding="utf-8"?>
-<cp:coreProperties xmlns:cp="http://schemas.openxmlformats.org/package/2006/metadata/core-properties" xmlns:dc="http://purl.org/dc/elements/1.1/" xmlns:dcterms="http://purl.org/dc/terms/" xmlns:dcmitype="http://purl.org/dc/dcmitype/" xmlns:xsi="http://www.w3.org/2001/XMLSchema-instance">
-  <dc:creator>Windows User</dc:creator>
-  <dcterms:created xsi:type="dcterms:W3CDTF">2026-06-05T10:32:43Z</dcterms:created>
-  <dcterms:modified xsi:type="dcterms:W3CDTF">2026-06-05T10:32:43Z</dcterms:modified>
-</cp:coreProperties>
-</file>
-
-<file path=docProps\custom.xml><?xml version="1.0" encoding="utf-8"?>
-<Properties xmlns="http://schemas.openxmlformats.org/officeDocument/2006/custom-properties" xmlns:vt="http://schemas.openxmlformats.org/officeDocument/2006/docPropsVTypes">
-  <property fmtid="{D5CDD505-2E9C-101B-9397-08002B2CF9AE}" pid="2" name="Converter">
-    <vt:lpwstr>SolidFramework v10.0.19910.1</vt:lpwstr>
-  </property>
-  <property fmtid="{D5CDD505-2E9C-101B-9397-08002B2CF9AE}" pid="3" name="Created">
-    <vt:filetime>2026-06-05T00:00:00Z</vt:filetime>
-  </property>
-  <property fmtid="{D5CDD505-2E9C-101B-9397-08002B2CF9AE}" pid="4" name="Creator">
-    <vt:lpwstr>Microsoft® Excel® 2019</vt:lpwstr>
-  </property>
-  <property fmtid="{D5CDD505-2E9C-101B-9397-08002B2CF9AE}" pid="5" name="LastSaved">
-    <vt:filetime>2026-06-05T00:00:00Z</vt:filetime>
-  </property>
-  <property fmtid="{D5CDD505-2E9C-101B-9397-08002B2CF9AE}" pid="6" name="Producer">
-    <vt:lpwstr>Microsoft® Excel® 2019</vt:lpwstr>
-  </property>
-</Properties>
-</file>
-
-<file path=word\document.xml><?xml version="1.0" encoding="utf-8"?>
+<file path=word/document.xml><?xml version="1.0" encoding="utf-8"?>
 <w:document xmlns:mc="http://schemas.openxmlformats.org/markup-compatibility/2006" xmlns:ve="http://schemas.openxmlformats.org/markup-compatibility/2006" xmlns:o="urn:schemas-microsoft-com:office:office" xmlns:r="http://schemas.openxmlformats.org/officeDocument/2006/relationships" xmlns:m="http://schemas.openxmlformats.org/officeDocument/2006/math" xmlns:v="urn:schemas-microsoft-com:vml" xmlns:wp="http://schemas.openxmlformats.org/drawingml/2006/wordprocessingDrawing" xmlns:w10="urn:schemas-microsoft-com:office:word" xmlns:w="http://schemas.openxmlformats.org/wordprocessingml/2006/main" xmlns:wne="http://schemas.microsoft.com/office/word/2006/wordml" xmlns:a="http://schemas.openxmlformats.org/drawingml/2006/main" xmlns:pic="http://schemas.openxmlformats.org/drawingml/2006/picture" xmlns:wpg="http://schemas.microsoft.com/office/word/2010/wordprocessingGroup" xmlns:wps="http://schemas.microsoft.com/office/word/2010/wordprocessingShape" xmlns:w14="http://schemas.microsoft.com/office/word/2010/wordml" mc:Ignorable="w14" xml:space="preserve">
   <w:body>
     <w:tbl>
@@ -540,7 +498,7 @@
               <w:pStyle w:val="TableParagraph"/>
             </w:pPr>
             <w:r>
-              <w:t>{LoaiHinhSK}</w:t>
+              <w:t>{LoaiHinhSuKien}</w:t>
             </w:r>
           </w:p>
         </w:tc>
@@ -657,7 +615,7 @@
               <w:rPr>
                 <w:sz w:val="20"/>
               </w:rPr>
-              <w:t>{KhuVuc}</w:t>
+              <w:t>{TenKhuVuc}</w:t>
             </w:r>
           </w:p>
         </w:tc>
@@ -1132,7 +1090,7 @@
               <w:pStyle w:val="TableParagraph"/>
             </w:pPr>
             <w:r>
-              <w:t>{ChiTiet}</w:t>
+              <w:t>{GhiChu}</w:t>
             </w:r>
           </w:p>
         </w:tc>
@@ -1161,7 +1119,7 @@
               <w:pStyle w:val="TableParagraph"/>
             </w:pPr>
             <w:r>
-              <w:t>{SL}</w:t>
+              <w:t>{SoLuong}</w:t>
             </w:r>
           </w:p>
         </w:tc>
@@ -1295,7 +1253,7 @@
               <w:pStyle w:val="TableParagraph"/>
             </w:pPr>
             <w:r>
-              <w:t>{TongTienMuc}</w:t>
+              <w:t>{TongCongTamTinh}</w:t>
             </w:r>
           </w:p>
         </w:tc>
@@ -2292,7 +2250,7 @@
               <w:pStyle w:val="TableParagraph"/>
             </w:pPr>
             <w:r>
-              <w:t>{ChiTiet}</w:t>
+              <w:t>{GhiChu}</w:t>
             </w:r>
           </w:p>
         </w:tc>
@@ -2321,7 +2279,7 @@
               <w:pStyle w:val="TableParagraph"/>
             </w:pPr>
             <w:r>
-              <w:t>{SL}</w:t>
+              <w:t>{SoLuong}</w:t>
             </w:r>
           </w:p>
         </w:tc>
@@ -2968,18 +2926,7 @@
 </w:document>
 </file>
 
-<file path=word\fontTable.xml><?xml version="1.0" encoding="utf-8"?>
-<w:fonts xmlns:r="http://schemas.openxmlformats.org/officeDocument/2006/relationships" xmlns:w="http://schemas.openxmlformats.org/wordprocessingml/2006/main">
-  <w:font w:name="Times New Roman">
-    <w:altName w:val="Times New Roman"/>
-    <w:charset w:val="1"/>
-    <w:family w:val="roman"/>
-    <w:pitch w:val="variable"/>
-  </w:font>
-</w:fonts>
-</file>
-
-<file path=word\numbering.xml><?xml version="1.0" encoding="utf-8"?>
+<file path=word/numbering.xml><?xml version="1.0" encoding="utf-8"?>
 <w:numbering xmlns:ve="http://schemas.openxmlformats.org/markup-compatibility/2006" xmlns:o="urn:schemas-microsoft-com:office:office" xmlns:r="http://schemas.openxmlformats.org/officeDocument/2006/relationships" xmlns:m="http://schemas.openxmlformats.org/officeDocument/2006/math" xmlns:v="urn:schemas-microsoft-com:vml" xmlns:wp="http://schemas.openxmlformats.org/drawingml/2006/wordprocessingDrawing" xmlns:w10="urn:schemas-microsoft-com:office:word" xmlns:w="http://schemas.openxmlformats.org/wordprocessingml/2006/main" xmlns:wne="http://schemas.microsoft.com/office/word/2006/wordml">
   <w:abstractNum w:abstractNumId="2">
     <w:multiLevelType w:val="hybridMultilevel"/>
@@ -3371,23 +3318,7 @@
 </w:numbering>
 </file>
 
-<file path=word\settings.xml><?xml version="1.0" encoding="utf-8"?>
-<w:settings xmlns:o="urn:schemas-microsoft-com:office:office" xmlns:r="http://schemas.openxmlformats.org/officeDocument/2006/relationships" xmlns:m="http://schemas.openxmlformats.org/officeDocument/2006/math" xmlns:v="urn:schemas-microsoft-com:vml" xmlns:w10="urn:schemas-microsoft-com:office:word" xmlns:w="http://schemas.openxmlformats.org/wordprocessingml/2006/main" xmlns:sl="http://schemas.openxmlformats.org/schemaLibrary/2006/main">
-  <w:zoom w:percent="120"/>
-  <w:defaultTabStop w:val="720"/>
-  <w:drawingGridHorizontalSpacing w:val="110"/>
-  <w:displayHorizontalDrawingGridEvery w:val="2"/>
-  <w:characterSpacingControl w:val="doNotCompress"/>
-  <w:compat>
-    <w:ulTrailSpace/>
-    <w:shapeLayoutLikeWW8/>
-    <w:useFELayout/>
-    <w:compatSetting w:val="14" w:uri="http://schemas.microsoft.com/office/word" w:name="compatibilityMode"/>
-  </w:compat>
-</w:settings>
-</file>
-
-<file path=word\styles.xml><?xml version="1.0" encoding="utf-8"?>
+<file path=word/styles.xml><?xml version="1.0" encoding="utf-8"?>
 <w:styles xmlns:r="http://schemas.openxmlformats.org/officeDocument/2006/relationships" xmlns:w="http://schemas.openxmlformats.org/wordprocessingml/2006/main">
   <w:docDefaults>
     <w:rPrDefault>
@@ -3470,7 +3401,7 @@
 </w:styles>
 </file>
 
-<file path=word\theme\theme1.xml><?xml version="1.0" encoding="utf-8"?>
+<file path=word/theme/theme1.xml><?xml version="1.0" encoding="utf-8"?>
 <a:theme xmlns:a="http://schemas.openxmlformats.org/drawingml/2006/main" name="Office Theme">
   <a:themeElements>
     <a:clrScheme name="Office">

</xml_diff>

<commit_message>
feat: implement API_DanhSachBaoGia stored procedure and add bao_gia.docx template for quotation module
</commit_message>
<xml_diff>
--- a/backend-app/samples/bao_gia.docx
+++ b/backend-app/samples/bao_gia.docx
@@ -1117,6 +1117,7 @@
           <w:p>
             <w:pPr>
               <w:pStyle w:val="TableParagraph"/>
+              <w:jc w:val="right"/>
             </w:pPr>
             <w:r>
               <w:t>{SoLuong}</w:t>
@@ -1130,6 +1131,7 @@
           <w:p>
             <w:pPr>
               <w:pStyle w:val="TableParagraph"/>
+              <w:jc w:val="right"/>
             </w:pPr>
             <w:r>
               <w:t>{DonGia}</w:t>
@@ -1156,6 +1158,7 @@
           <w:p>
             <w:pPr>
               <w:pStyle w:val="TableParagraph"/>
+              <w:jc w:val="right"/>
             </w:pPr>
             <w:r>
               <w:t>{ThanhTien}{/IsData}{/DanhSachDichVu}</w:t>
@@ -1251,6 +1254,7 @@
           <w:p>
             <w:pPr>
               <w:pStyle w:val="TableParagraph"/>
+              <w:jc w:val="right"/>
             </w:pPr>
             <w:r>
               <w:t>{TongCongTamTinh}</w:t>
@@ -1399,6 +1403,7 @@
           <w:p>
             <w:pPr>
               <w:pStyle w:val="TableParagraph"/>
+              <w:jc w:val="right"/>
             </w:pPr>
             <w:r>
               <w:t>{PhiPhucVu}</w:t>
@@ -1577,6 +1582,7 @@
           <w:p>
             <w:pPr>
               <w:pStyle w:val="TableParagraph"/>
+              <w:jc w:val="right"/>
             </w:pPr>
             <w:r>
               <w:t>{TongCongChuaVAT}</w:t>
@@ -1752,6 +1758,7 @@
           <w:p>
             <w:pPr>
               <w:pStyle w:val="TableParagraph"/>
+              <w:jc w:val="right"/>
             </w:pPr>
             <w:r>
               <w:t>{VAT8}</w:t>
@@ -1849,6 +1856,7 @@
           <w:p>
             <w:pPr>
               <w:pStyle w:val="TableParagraph"/>
+              <w:jc w:val="right"/>
             </w:pPr>
             <w:r>
               <w:t>{VAT10}</w:t>
@@ -2027,6 +2035,7 @@
           <w:p>
             <w:pPr>
               <w:pStyle w:val="TableParagraph"/>
+              <w:jc w:val="right"/>
             </w:pPr>
             <w:r>
               <w:t>{TongCongTamTinh}</w:t>
@@ -2277,6 +2286,7 @@
           <w:p>
             <w:pPr>
               <w:pStyle w:val="TableParagraph"/>
+              <w:jc w:val="right"/>
             </w:pPr>
             <w:r>
               <w:t>{SoLuong}</w:t>
@@ -2290,6 +2300,7 @@
           <w:p>
             <w:pPr>
               <w:pStyle w:val="TableParagraph"/>
+              <w:jc w:val="right"/>
             </w:pPr>
             <w:r>
               <w:t>{DonGia}</w:t>
@@ -2317,6 +2328,7 @@
           <w:p>
             <w:pPr>
               <w:pStyle w:val="TableParagraph"/>
+              <w:jc w:val="right"/>
             </w:pPr>
             <w:r>
               <w:t>{ThanhTien}{/DanhSachThamKhao}</w:t>

</xml_diff>